<commit_message>
Set table borders to 0.90 pt (OOXML sz=7) on all styled encadrés
Apply 0.90 pt border (7 eighths-of-a-point in OOXML w:sz) to all six
sides (top/bottom/left/right/insideH/insideV) of every styled table
in supplementary chapters 40-56. Border color matches table header
dark blue (2C3A4A).

Co-Authored-By: Claude Haiku 4.5 <noreply@anthropic.com>
Claude-Session: https://claude.ai/code/session_016YUsTGkJ7s85TXfcngyaWu
</commit_message>
<xml_diff>
--- a/la-paix-on-peut-leviter.docx
+++ b/la-paix-on-peut-leviter.docx
@@ -33482,9 +33482,16 @@
     </w:p>
     <w:tbl>
       <w:tblPr>
-        <w:tblStyle w:val="Grilledutableau"/>
         <w:tblW w:type="auto" w:w="0"/>
         <w:tblLook w:firstColumn="1" w:firstRow="1" w:lastColumn="0" w:lastRow="0" w:noHBand="0" w:noVBand="1" w:val="04A0"/>
+        <w:tblBorders>
+          <w:top w:val="single" w:sz="7" w:space="0" w:color="2C3A4A"/>
+          <w:left w:val="single" w:sz="7" w:space="0" w:color="2C3A4A"/>
+          <w:bottom w:val="single" w:sz="7" w:space="0" w:color="2C3A4A"/>
+          <w:right w:val="single" w:sz="7" w:space="0" w:color="2C3A4A"/>
+          <w:insideH w:val="single" w:sz="7" w:space="0" w:color="2C3A4A"/>
+          <w:insideV w:val="single" w:sz="7" w:space="0" w:color="2C3A4A"/>
+        </w:tblBorders>
       </w:tblPr>
       <w:tblGrid>
         <w:gridCol w:w="6624"/>
@@ -33559,9 +33566,16 @@
     <w:p/>
     <w:tbl>
       <w:tblPr>
-        <w:tblStyle w:val="Grilledutableau"/>
         <w:tblW w:type="auto" w:w="0"/>
         <w:tblLook w:firstColumn="1" w:firstRow="1" w:lastColumn="0" w:lastRow="0" w:noHBand="0" w:noVBand="1" w:val="04A0"/>
+        <w:tblBorders>
+          <w:top w:val="single" w:sz="7" w:space="0" w:color="2C3A4A"/>
+          <w:left w:val="single" w:sz="7" w:space="0" w:color="2C3A4A"/>
+          <w:bottom w:val="single" w:sz="7" w:space="0" w:color="2C3A4A"/>
+          <w:right w:val="single" w:sz="7" w:space="0" w:color="2C3A4A"/>
+          <w:insideH w:val="single" w:sz="7" w:space="0" w:color="2C3A4A"/>
+          <w:insideV w:val="single" w:sz="7" w:space="0" w:color="2C3A4A"/>
+        </w:tblBorders>
       </w:tblPr>
       <w:tblGrid>
         <w:gridCol w:w="6624"/>

</xml_diff>